<commit_message>
Bold key resume availability details
</commit_message>
<xml_diff>
--- a/assets/resume/赵亚杰-两年经验-AI产品经理-手机可编辑版.docx
+++ b/assets/resume/赵亚杰-两年经验-AI产品经理-手机可编辑版.docx
@@ -560,6 +560,7 @@
               <w:rPr>
                 <w:rFonts w:ascii="Arial" w:hAnsi="Arial" w:eastAsia="Microsoft YaHei" w:cs="Arial"/>
                 <w:b/>
+                <w:bCs/>
                 <w:color w:val="333333"/>
                 <w:sz w:val="16"/>
                 <w:lang w:val="en-US" w:eastAsia="zh-CN"/>
@@ -570,6 +571,8 @@
               <w:r>
                 <w:rPr>
                   <w:rFonts w:ascii="Arial" w:hAnsi="Arial" w:eastAsia="Microsoft YaHei"/>
+                  <w:b/>
+                  <w:bCs/>
                   <w:color w:val="3876CB"/>
                   <w:u w:val="single"/>
                   <w:sz w:val="16"/>
@@ -613,6 +616,7 @@
               <w:rPr>
                 <w:rFonts w:ascii="Arial" w:hAnsi="Arial" w:eastAsia="Microsoft YaHei" w:cs="Arial"/>
                 <w:b/>
+                <w:bCs/>
                 <w:color w:val="333333"/>
                 <w:sz w:val="16"/>
                 <w:lang w:val="en-US" w:eastAsia="zh-CN"/>
@@ -622,7 +626,8 @@
             <w:r>
               <w:rPr>
                 <w:rFonts w:ascii="Arial" w:hAnsi="Arial" w:eastAsia="Microsoft YaHei" w:cs="Arial"/>
-                <w:b w:val="0"/>
+                <w:b/>
+                <w:bCs/>
                 <w:color w:val="555555"/>
                 <w:sz w:val="16"/>
                 <w:lang w:val="en-US" w:eastAsia="zh-CN"/>

</xml_diff>